<commit_message>
Chinh sua Chuong 2 sau khi duyet ky: de bai trich nguyen van, thuat ngu dung theo giao trinh (muc 2.4, 2.5, 2.8)
</commit_message>
<xml_diff>
--- a/Chuong2_BaiTap1.docx
+++ b/Chuong2_BaiTap1.docx
@@ -73,7 +73,7 @@
           <w:sz w:val="32"/>
           <w:szCs w:val="32"/>
         </w:rPr>
-        <w:t xml:space="preserve">BÀI TẬP 1. PHÂN TÍCH SỰ PHÁT TRIỂN CỦA TRỤC CHỦ ĐỀ “THUẬT TOÁN VÀ LẬP TRÌNH” THEO NGUYÊN TẮC ĐỒNG TÂM – XOẮN ỐC</w:t>
+        <w:t xml:space="preserve">BÀI TẬP 1. PHÂN TÍCH SỰ PHÁT TRIỂN CỦA CÁC MẠCH NỘI DUNG THEO NGUYÊN TẮC ĐỒNG TÂM – XOẮN ỐC</w:t>
       </w:r>
     </w:p>
     <w:tbl>
@@ -131,7 +131,7 @@
                 <w:sz w:val="26"/>
                 <w:szCs w:val="26"/>
               </w:rPr>
-              <w:t xml:space="preserve">Dựa vào nguyên tắc phát triển nội dung “đồng tâm – xoắn ốc” (mục 2.4.5), hãy lập bảng hệ thống hóa và phân tích sự tịnh tiến, mở rộng về mức độ Yêu cầu cần đạt của trục chủ đề “Thuật toán và Lập trình” (mạch CS, Chương trình GDPT 2018) qua 3 cấp học: Tiểu học, THCS và THPT.</w:t>
+              <w:t xml:space="preserve">Hãy chọn trục chủ đề “Thuật toán và Lập trình” (thuộc chủ đề lớn Giải quyết vấn đề với sự trợ giúp của máy tính) trong Chương trình môn Tin học GDPT 2018. Dựa vào 3 mạch nội dung (DL, ICT, CS) và nguyên tắc phát triển nội dung “đồng tâm – xoắn ốc” được học ở mục 2.4, anh/chị hãy lập bảng hệ thống hóa và phân tích sự tịnh tiến, mở rộng về mức độ Yêu cầu cần đạt của chủ đề này qua 3 cấp học: Tiểu học, THCS và THPT.</w:t>
             </w:r>
           </w:p>
         </w:tc>
@@ -154,6 +154,28 @@
           <w:szCs w:val="28"/>
         </w:rPr>
         <w:t xml:space="preserve">1. Bảng hệ thống hóa Yêu cầu cần đạt qua 3 cấp học</w:t>
+      </w:r>
+    </w:p>
+    <w:p>
+      <w:pPr>
+        <w:keepNext w:val="false"/>
+        <w:keepLines w:val="false"/>
+        <w:spacing w:after="80" w:before="0" w:line="312"/>
+        <w:ind w:firstLine="567"/>
+        <w:jc w:val="both"/>
+      </w:pPr>
+      <w:r>
+        <w:rPr>
+          <w:rFonts w:ascii="Times New Roman" w:cs="Times New Roman" w:eastAsia="Times New Roman" w:hAnsi="Times New Roman"/>
+          <w:b w:val="false"/>
+          <w:bCs w:val="false"/>
+          <w:i w:val="false"/>
+          <w:iCs w:val="false"/>
+          <w:color w:val="000000"/>
+          <w:sz w:val="26"/>
+          <w:szCs w:val="26"/>
+        </w:rPr>
+        <w:t xml:space="preserve">Trục chủ đề “Thuật toán và Lập trình” thuộc chủ đề lớn “Giải quyết vấn đề với sự trợ giúp của máy tính” (mạch CS – mục 2.4.1) và được phát triển xuyên suốt 3 cấp học như sau:</w:t>
       </w:r>
     </w:p>
     <w:p>
@@ -619,7 +641,7 @@
                 <w:sz w:val="24"/>
                 <w:szCs w:val="24"/>
               </w:rPr>
-              <w:t xml:space="preserve">Giai đoạn 2 – 3: tư duy bán trừu tượng → tư duy thuật toán, lập trình thực sự.</w:t>
+              <w:t xml:space="preserve">Giai đoạn 2 – Hình thành → Giai đoạn 3 – Phát triển: tư duy bán trừu tượng → tư duy thuật toán, lập trình thực sự.</w:t>
             </w:r>
           </w:p>
         </w:tc>
@@ -705,7 +727,7 @@
                 <w:sz w:val="24"/>
                 <w:szCs w:val="24"/>
               </w:rPr>
-              <w:t xml:space="preserve">Lập trình văn bản (Python/C++); cấu trúc dữ liệu mảng, xâu; sắp xếp nâng cao, tìm kiếm nhị phân; đánh giá độ phức tạp thuật toán.</w:t>
+              <w:t xml:space="preserve">Lập trình vạn năng dạng văn bản (Python/C++); cấu trúc dữ liệu mảng, xâu; sắp xếp nâng cao, tìm kiếm nhị phân; đánh giá độ phức tạp thuật toán.</w:t>
             </w:r>
           </w:p>
         </w:tc>
@@ -767,7 +789,7 @@
                 <w:sz w:val="24"/>
                 <w:szCs w:val="24"/>
               </w:rPr>
-              <w:t xml:space="preserve">Giai đoạn 4 – Chuyên sâu: tư duy trừu tượng, thiết kế và đánh giá.</w:t>
+              <w:t xml:space="preserve">Giai đoạn 4 – Chuyên sâu: tư duy trừu tượng; thiết kế hệ thống.</w:t>
             </w:r>
           </w:p>
         </w:tc>

</xml_diff>

<commit_message>
Chuong 2: bo kí hiệu (mũi tên, thanh dọc, ngoặc vuông), giải thích chi tiết dễ hiểu
</commit_message>
<xml_diff>
--- a/Chuong2_BaiTap1.docx
+++ b/Chuong2_BaiTap1.docx
@@ -153,14 +153,14 @@
           <w:sz w:val="28"/>
           <w:szCs w:val="28"/>
         </w:rPr>
-        <w:t xml:space="preserve">1. Bảng hệ thống hóa Yêu cầu cần đạt qua 3 cấp học</w:t>
+        <w:t xml:space="preserve">1. Hiểu nguyên tắc “đồng tâm – xoắn ốc”</w:t>
       </w:r>
     </w:p>
     <w:p>
       <w:pPr>
         <w:keepNext w:val="false"/>
         <w:keepLines w:val="false"/>
-        <w:spacing w:after="80" w:before="0" w:line="312"/>
+        <w:spacing w:after="120" w:before="0" w:line="312"/>
         <w:ind w:firstLine="567"/>
         <w:jc w:val="both"/>
       </w:pPr>
@@ -175,7 +175,70 @@
           <w:sz w:val="26"/>
           <w:szCs w:val="26"/>
         </w:rPr>
-        <w:t xml:space="preserve">Trục chủ đề “Thuật toán và Lập trình” thuộc chủ đề lớn “Giải quyết vấn đề với sự trợ giúp của máy tính” (mạch CS – mục 2.4.1) và được phát triển xuyên suốt 3 cấp học như sau:</w:t>
+        <w:t xml:space="preserve">Theo giáo trình (mục 2.4.5), chương trình Tin học được thiết kế theo nguyên tắc đồng tâm mở rộng (spiral curriculum), một nguyên tắc do nhà tâm lý học Jerome Bruner đề xuất. Theo nguyên tắc này, các chủ đề lớn được giới thiệu từ mức đơn giản, gắn với trải nghiệm cụ thể, rồi được quay lại và mở rộng ở các lớp cao hơn với độ trừu tượng và yêu cầu tư duy ngày càng tăng.</w:t>
+      </w:r>
+    </w:p>
+    <w:p>
+      <w:pPr>
+        <w:keepNext w:val="false"/>
+        <w:keepLines w:val="false"/>
+        <w:spacing w:after="120" w:before="0" w:line="312"/>
+        <w:ind w:firstLine="567"/>
+        <w:jc w:val="both"/>
+      </w:pPr>
+      <w:r>
+        <w:rPr>
+          <w:rFonts w:ascii="Times New Roman" w:cs="Times New Roman" w:eastAsia="Times New Roman" w:hAnsi="Times New Roman"/>
+          <w:b w:val="false"/>
+          <w:bCs w:val="false"/>
+          <w:i w:val="false"/>
+          <w:iCs w:val="false"/>
+          <w:color w:val="000000"/>
+          <w:sz w:val="26"/>
+          <w:szCs w:val="26"/>
+        </w:rPr>
+        <w:t xml:space="preserve">Có thể hình dung nguyên tắc này qua đúng hai chữ trong tên gọi của nó. Tính “đồng tâm” nghĩa là mọi cấp học đều quay lại cùng một lõi tri thức, giống các vòng tròn đồng tâm có chung một tâm; trong môn Tin học, tâm đó chính là tư duy thuật toán. Tính “xoắn ốc” nghĩa là mỗi lần quay lại, nội dung không lặp lại y nguyên mà được nâng lên một bậc, giống con ốc sên bò theo đường xoắn: đi hết một vòng thì vị trí đã cao hơn một vòng. Hai tính chất ghép lại tạo thành một cách thiết kế chương trình vừa bảo đảm tính liên thông, vừa không trùng lặp, đồng thời phù hợp với tiến trình nhận thức của học sinh: lúc nhỏ tư duy còn cụ thể thì học bằng trải nghiệm, khi lớn lên tư duy trừu tượng mới học bằng khái niệm và mã lệnh.</w:t>
+      </w:r>
+    </w:p>
+    <w:p>
+      <w:pPr>
+        <w:pStyle w:val="Heading2"/>
+        <w:keepNext/>
+        <w:spacing w:after="100" w:before="180" w:line="312"/>
+        <w:jc w:val="left"/>
+      </w:pPr>
+      <w:r>
+        <w:rPr>
+          <w:rFonts w:ascii="Times New Roman" w:cs="Times New Roman" w:eastAsia="Times New Roman" w:hAnsi="Times New Roman"/>
+          <w:b/>
+          <w:bCs/>
+          <w:color w:val="000000"/>
+          <w:sz w:val="28"/>
+          <w:szCs w:val="28"/>
+        </w:rPr>
+        <w:t xml:space="preserve">2. Bảng hệ thống hóa Yêu cầu cần đạt qua 3 cấp học</w:t>
+      </w:r>
+    </w:p>
+    <w:p>
+      <w:pPr>
+        <w:keepNext w:val="false"/>
+        <w:keepLines w:val="false"/>
+        <w:spacing w:after="80" w:before="0" w:line="312"/>
+        <w:ind w:firstLine="567"/>
+        <w:jc w:val="both"/>
+      </w:pPr>
+      <w:r>
+        <w:rPr>
+          <w:rFonts w:ascii="Times New Roman" w:cs="Times New Roman" w:eastAsia="Times New Roman" w:hAnsi="Times New Roman"/>
+          <w:b w:val="false"/>
+          <w:bCs w:val="false"/>
+          <w:i w:val="false"/>
+          <w:iCs w:val="false"/>
+          <w:color w:val="000000"/>
+          <w:sz w:val="26"/>
+          <w:szCs w:val="26"/>
+        </w:rPr>
+        <w:t xml:space="preserve">Trục chủ đề “Thuật toán và Lập trình” thuộc chủ đề lớn “Giải quyết vấn đề với sự trợ giúp của máy tính” và phát triển chủ yếu trong mạch Khoa học máy tính (mục 2.4.1). Qua ba cấp học, Yêu cầu cần đạt của trục chủ đề này tiến lên như sau:</w:t>
       </w:r>
     </w:p>
     <w:p>
@@ -209,12 +272,13 @@
           <w:insideH w:val="single" w:color="C9D3DE" w:sz="4"/>
           <w:insideV w:val="single" w:color="C9D3DE" w:sz="4"/>
         </w:tblBorders>
+        <w:tblLayout w:type="fixed"/>
       </w:tblPr>
       <w:tblGrid>
-        <w:gridCol w:w="100"/>
-        <w:gridCol w:w="100"/>
-        <w:gridCol w:w="100"/>
-        <w:gridCol w:w="100"/>
+        <w:gridCol w:w="1494"/>
+        <w:gridCol w:w="3515"/>
+        <w:gridCol w:w="1582"/>
+        <w:gridCol w:w="2197"/>
       </w:tblGrid>
       <w:tr>
         <w:trPr>
@@ -313,7 +377,7 @@
                 <w:sz w:val="24"/>
                 <w:szCs w:val="24"/>
               </w:rPr>
-              <w:t xml:space="preserve">Công cụ – ngôn ngữ</w:t>
+              <w:t xml:space="preserve">Công cụ và ngôn ngữ</w:t>
             </w:r>
           </w:p>
         </w:tc>
@@ -400,7 +464,7 @@
                 <w:sz w:val="24"/>
                 <w:szCs w:val="24"/>
               </w:rPr>
-              <w:t xml:space="preserve"> (lớp 3 – 5)</w:t>
+              <w:t xml:space="preserve"> (lớp 3 đến lớp 5)</w:t>
             </w:r>
           </w:p>
         </w:tc>
@@ -462,7 +526,7 @@
                 <w:sz w:val="24"/>
                 <w:szCs w:val="24"/>
               </w:rPr>
-              <w:t xml:space="preserve">Robot trực quan, Scratch Jr (khối kéo – thả).</w:t>
+              <w:t xml:space="preserve">Robot trực quan, Scratch Jr với khối lệnh kéo và thả.</w:t>
             </w:r>
           </w:p>
         </w:tc>
@@ -493,7 +557,7 @@
                 <w:sz w:val="24"/>
                 <w:szCs w:val="24"/>
               </w:rPr>
-              <w:t xml:space="preserve">Giai đoạn 1 – Làm quen: tư duy cụ thể, học qua trải nghiệm.</w:t>
+              <w:t xml:space="preserve">Giai đoạn 1 (Làm quen): tư duy cụ thể, học qua trải nghiệm.</w:t>
             </w:r>
           </w:p>
         </w:tc>
@@ -548,7 +612,7 @@
                 <w:sz w:val="24"/>
                 <w:szCs w:val="24"/>
               </w:rPr>
-              <w:t xml:space="preserve"> (lớp 6 – 9)</w:t>
+              <w:t xml:space="preserve"> (lớp 6 đến lớp 9)</w:t>
             </w:r>
           </w:p>
         </w:tc>
@@ -579,7 +643,7 @@
                 <w:sz w:val="24"/>
                 <w:szCs w:val="24"/>
               </w:rPr>
-              <w:t xml:space="preserve">Hiểu khái niệm thuật toán; biểu diễn bằng lưu đồ; thuật toán tuần tự, rẽ nhánh, lặp; cài đặt hàm tìm kiếm tuyến tính, sắp xếp nổi bọt.</w:t>
+              <w:t xml:space="preserve">Hiểu khái niệm thuật toán; biểu diễn thuật toán bằng lưu đồ; thuật toán tuần tự, rẽ nhánh, lặp; cài đặt hàm tìm kiếm tuyến tính, sắp xếp nổi bọt.</w:t>
             </w:r>
           </w:p>
         </w:tc>
@@ -610,7 +674,7 @@
                 <w:sz w:val="24"/>
                 <w:szCs w:val="24"/>
               </w:rPr>
-              <w:t xml:space="preserve">Scratch, chuyển sang Python ở lớp 8 – 9.</w:t>
+              <w:t xml:space="preserve">Scratch, chuyển sang Python ở lớp 8 và lớp 9.</w:t>
             </w:r>
           </w:p>
         </w:tc>
@@ -641,7 +705,7 @@
                 <w:sz w:val="24"/>
                 <w:szCs w:val="24"/>
               </w:rPr>
-              <w:t xml:space="preserve">Giai đoạn 2 – Hình thành → Giai đoạn 3 – Phát triển: tư duy bán trừu tượng → tư duy thuật toán, lập trình thực sự.</w:t>
+              <w:t xml:space="preserve">Giai đoạn 2 (Hình thành), rồi tiếp tục lên Giai đoạn 3 (Phát triển): từ tư duy bán trừu tượng đến tư duy thuật toán, lập trình thực sự.</w:t>
             </w:r>
           </w:p>
         </w:tc>
@@ -696,7 +760,7 @@
                 <w:sz w:val="24"/>
                 <w:szCs w:val="24"/>
               </w:rPr>
-              <w:t xml:space="preserve"> (lớp 10 – 12, định hướng CS)</w:t>
+              <w:t xml:space="preserve"> (lớp 10 đến lớp 12, định hướng Khoa học máy tính)</w:t>
             </w:r>
           </w:p>
         </w:tc>
@@ -727,7 +791,7 @@
                 <w:sz w:val="24"/>
                 <w:szCs w:val="24"/>
               </w:rPr>
-              <w:t xml:space="preserve">Lập trình vạn năng dạng văn bản (Python/C++); cấu trúc dữ liệu mảng, xâu; sắp xếp nâng cao, tìm kiếm nhị phân; đánh giá độ phức tạp thuật toán.</w:t>
+              <w:t xml:space="preserve">Lập trình vạn năng dạng văn bản bằng Python hoặc C++; cấu trúc dữ liệu mảng, xâu; thuật toán sắp xếp nâng cao, tìm kiếm nhị phân; đánh giá độ phức tạp thuật toán.</w:t>
             </w:r>
           </w:p>
         </w:tc>
@@ -789,7 +853,7 @@
                 <w:sz w:val="24"/>
                 <w:szCs w:val="24"/>
               </w:rPr>
-              <w:t xml:space="preserve">Giai đoạn 4 – Chuyên sâu: tư duy trừu tượng; thiết kế hệ thống.</w:t>
+              <w:t xml:space="preserve">Giai đoạn 4 (Chuyên sâu): tư duy trừu tượng, thiết kế hệ thống.</w:t>
             </w:r>
           </w:p>
         </w:tc>
@@ -816,7 +880,7 @@
           <w:sz w:val="28"/>
           <w:szCs w:val="28"/>
         </w:rPr>
-        <w:t xml:space="preserve">2. Phân tích tính “Đồng tâm”</w:t>
+        <w:t xml:space="preserve">3. Phân tích tính “Đồng tâm”</w:t>
       </w:r>
     </w:p>
     <w:p>
@@ -838,7 +902,7 @@
           <w:sz w:val="26"/>
           <w:szCs w:val="26"/>
         </w:rPr>
-        <w:t xml:space="preserve">Ở cả 3 cấp, chủ đề luôn quay lại cùng một lõi tri thức là tư duy thuật toán: các bước tuần tự, dữ liệu (biến), cấu trúc điều khiển (rẽ nhánh, lặp). Chủ đề không bị bỏ lại mà được quay lại đào sâu dần, bảo đảm tính liên thông, không trùng lặp nội dung.</w:t>
+        <w:t xml:space="preserve">Ở cả ba cấp học, trục chủ đề luôn quay lại cùng một lõi tri thức là tư duy thuật toán, bao gồm ba thành phần: các bước xử lý tuần tự, dữ liệu cùng biến lưu giữ dữ liệu, và các cấu trúc điều khiển như rẽ nhánh, lặp. Cấp dưới không bị bỏ lại khi lên cấp trên mà trở thành nền móng cho cấp trên: muốn cài đặt hàm sắp xếp nổi bọt ở lớp 8, học sinh phải dùng lại khái niệm thuật toán và cách biểu diễn lưu đồ đã học ở lớp 6, lớp 7; muốn đánh giá độ phức tạp của thuật toán ở THPT, học sinh phải dùng lại kỹ năng cài đặt bằng Python đã rèn ở THCS. Nhờ lõi đồng tâm này, nội dung ba cấp học liên thông chặt chẽ với nhau, không trùng lặp và không bị đứt gãy.</w:t>
       </w:r>
     </w:p>
     <w:p>
@@ -857,7 +921,7 @@
           <w:sz w:val="28"/>
           <w:szCs w:val="28"/>
         </w:rPr>
-        <w:t xml:space="preserve">3. Phân tích tính “Xoắn ốc”</w:t>
+        <w:t xml:space="preserve">4. Phân tích tính “Xoắn ốc”</w:t>
       </w:r>
     </w:p>
     <w:p>
@@ -879,7 +943,7 @@
           <w:sz w:val="26"/>
           <w:szCs w:val="26"/>
         </w:rPr>
-        <w:t xml:space="preserve">Mỗi vòng quay lại, mức Yêu cầu cần đạt tăng theo 3 bậc: làm quen trực quan (Tiểu học) → hình thành khái niệm, biểu diễn (THCS) → cài đặt và đánh giá (THPT). Công cụ chuyển từ khối kéo – thả sang mã lệnh ký tự; độ phức tạp bài toán tăng dần – phù hợp tiến trình nhận thức của học sinh.</w:t>
+        <w:t xml:space="preserve">Mỗi vòng quay lại chủ đề, Yêu cầu cần đạt tăng lên theo ba bậc rõ rệt: ở Tiểu học là làm quen trực quan; đến THCS là hình thành khái niệm và biểu diễn thuật toán; đến THPT là cài đặt và đánh giá thuật toán. Song song với đó, công cụ chuyển từ khối lệnh kéo và thả sang mã lệnh dạng kí tự, và độ phức tạp của bài toán tăng dần. Đáng chú ý là đường phát triển này tạo thành đường xoắn chứ không phải vòng tròn khép kín: nếu học sinh chỉ học lại đúng những gì cũ thì đó mới là vòng tròn; nhưng ở đây, mỗi vòng quay lại đều nâng cấp yêu cầu về độ trừu tượng và mức tư duy, nên nội dung đi lên theo đường xoắn, phù hợp với tiến trình nhận thức của học sinh.</w:t>
       </w:r>
     </w:p>
     <w:p>
@@ -898,7 +962,7 @@
           <w:sz w:val="28"/>
           <w:szCs w:val="28"/>
         </w:rPr>
-        <w:t xml:space="preserve">4. Ý nghĩa sư phạm</w:t>
+        <w:t xml:space="preserve">5. Ý nghĩa sư phạm</w:t>
       </w:r>
     </w:p>
     <w:p>
@@ -920,7 +984,7 @@
           <w:sz w:val="26"/>
           <w:szCs w:val="26"/>
         </w:rPr>
-        <w:t xml:space="preserve">Nắm vững logic đồng tâm – xoắn ốc giúp giáo viên xác định đúng “vị trí” của mỗi bài dạy: tránh dạy trùng lặp kiến thức cấp dưới hoặc vượt quá tiến trình nhận thức của học sinh.</w:t>
+        <w:t xml:space="preserve">Nắm vững logic đồng tâm, xoắn ốc giúp giáo viên xác định đúng vị trí của mỗi bài dạy trên đường xoắn: biết chắc học sinh đã có nền kiến thức nào từ cấp dưới và cần nâng lên bậc tư duy nào ở bài hiện tại. Nhờ đó, giáo viên tránh được hai sai lầm ngược chiều nhau: dạy trùng lặp kiến thức cấp dưới khiến học sinh nhàm chán, hoặc vượt quá tiến trình nhận thức khiến học sinh không theo kịp. Đây chính là mục đích sư phạm mà giáo trình nêu khi giao bài tập này: nhận diện rõ cách một đơn vị tri thức được nâng cấp từ trực quan, đơn giản ở cấp dưới lên trừu tượng, chuyên sâu ở cấp trên.</w:t>
       </w:r>
     </w:p>
     <w:sectPr>

</xml_diff>